<commit_message>
Terms of Service draft v2 after comparing six AU shelving retailers
Co-Authored-By: Claude Sonnet 5.5 <noreply@anthropic.com>
</commit_message>
<xml_diff>
--- a/docs/policy-drafts/terms-of-service.docx
+++ b/docs/policy-drafts/terms-of-service.docx
@@ -35,7 +35,7 @@
           <w:sz w:val="20"/>
           <w:szCs w:val="20"/>
         </w:rPr>
-        <w:t xml:space="preserve">Draft for review.</w:t>
+        <w:t xml:space="preserve">Draft for review (version 2).</w:t>
       </w:r>
       <w:r>
         <w:rPr>
@@ -43,7 +43,7 @@
           <w:sz w:val="20"/>
           <w:szCs w:val="20"/>
         </w:rPr>
-        <w:t xml:space="preserve"> Written from the details already on the Super Shelving site (FAQs page). Anything in </w:t>
+        <w:t xml:space="preserve"> Written from the details already on the Super Shelving site (FAQs page) and updated after comparing six Australian shelving retailers' terms. Anything in </w:t>
       </w:r>
       <w:r>
         <w:rPr>
@@ -62,7 +62,7 @@
           <w:sz w:val="20"/>
           <w:szCs w:val="20"/>
         </w:rPr>
-        <w:t xml:space="preserve"> is a placeholder or an assumption to confirm. Not legal advice - have a lawyer check this before you publish it, especially sections 9, 10 and 12.</w:t>
+        <w:t xml:space="preserve"> is a placeholder or an assumption to confirm. Not legal advice - have a lawyer check this before you publish it, especially sections 9, 10, 13 and 14.</w:t>
       </w:r>
     </w:p>
     <w:p>
@@ -319,6 +319,22 @@
     </w:p>
     <w:p>
       <w:pPr>
+        <w:pStyle w:val="ListParagraph"/>
+        <w:numPr>
+          <w:ilvl w:val="0"/>
+          <w:numId w:val="2"/>
+        </w:numPr>
+        <w:spacing w:after="100" w:line="300"/>
+      </w:pPr>
+      <w:r>
+        <w:rPr>
+          <w:rFonts w:ascii="Arial" w:cs="Arial" w:eastAsia="Arial" w:hAnsi="Arial"/>
+        </w:rPr>
+        <w:t xml:space="preserve">Minor differences between a product and its description, such as small variations in size or finish that do not affect how it works, are not a fault.</w:t>
+      </w:r>
+    </w:p>
+    <w:p>
+      <w:pPr>
         <w:pStyle w:val="Heading2"/>
         <w:keepNext/>
         <w:spacing w:after="120" w:before="280"/>
@@ -441,7 +457,7 @@
         <w:rPr>
           <w:rFonts w:ascii="Arial" w:cs="Arial" w:eastAsia="Arial" w:hAnsi="Arial"/>
         </w:rPr>
-        <w:t xml:space="preserve">If a price is clearly wrong because of an error, we may cancel the order and refund you in full, or give you the choice to buy at the correct price.</w:t>
+        <w:t xml:space="preserve">If a price, description or delivery charge on our website is clearly wrong because of an error, we may correct it and cancel the order, even after you have placed it. If we cancel, we will refund you in full, or give you the choice to buy at the correct price.</w:t>
       </w:r>
     </w:p>
     <w:p>
@@ -519,7 +535,39 @@
         <w:rPr>
           <w:rFonts w:ascii="Arial" w:cs="Arial" w:eastAsia="Arial" w:hAnsi="Arial"/>
         </w:rPr>
-        <w:t xml:space="preserve">We may decline or cancel an order, for example if stock is unavailable, there is a pricing error, or we cannot verify your details. If we cancel after you've paid, we will refund you in full.</w:t>
+        <w:t xml:space="preserve">We may decline or cancel an order, for example if stock is unavailable, there is a pricing error, we cannot verify your details, or the order looks like it is being placed for resale without our agreement. If we cancel after you have paid, we will refund you in full.</w:t>
+      </w:r>
+    </w:p>
+    <w:p>
+      <w:pPr>
+        <w:pStyle w:val="ListParagraph"/>
+        <w:numPr>
+          <w:ilvl w:val="0"/>
+          <w:numId w:val="2"/>
+        </w:numPr>
+        <w:spacing w:after="100" w:line="300"/>
+      </w:pPr>
+      <w:r>
+        <w:rPr>
+          <w:rFonts w:ascii="Arial" w:cs="Arial" w:eastAsia="Arial" w:hAnsi="Arial"/>
+        </w:rPr>
+        <w:t xml:space="preserve">We may limit the quantity of a product you can buy in one order.</w:t>
+      </w:r>
+    </w:p>
+    <w:p>
+      <w:pPr>
+        <w:pStyle w:val="ListParagraph"/>
+        <w:numPr>
+          <w:ilvl w:val="0"/>
+          <w:numId w:val="2"/>
+        </w:numPr>
+        <w:spacing w:after="100" w:line="300"/>
+      </w:pPr>
+      <w:r>
+        <w:rPr>
+          <w:rFonts w:ascii="Arial" w:cs="Arial" w:eastAsia="Arial" w:hAnsi="Arial"/>
+        </w:rPr>
+        <w:t xml:space="preserve">Please give us accurate and complete details, and keep your contact details up to date so we can complete your order.</w:t>
       </w:r>
     </w:p>
     <w:p>
@@ -600,7 +648,7 @@
           <w:sz w:val="26"/>
           <w:szCs w:val="26"/>
         </w:rPr>
-        <w:t xml:space="preserve">7. Delivery and pickup</w:t>
+        <w:t xml:space="preserve">7. Delivery, pickup and tracking</w:t>
       </w:r>
     </w:p>
     <w:p>
@@ -626,6 +674,17 @@
           <w:rFonts w:ascii="Arial" w:cs="Arial" w:eastAsia="Arial" w:hAnsi="Arial"/>
         </w:rPr>
         <w:t xml:space="preserve">, which forms part of these terms.</w:t>
+      </w:r>
+    </w:p>
+    <w:p>
+      <w:pPr>
+        <w:spacing w:after="160" w:line="300"/>
+      </w:pPr>
+      <w:r>
+        <w:rPr>
+          <w:rFonts w:ascii="Arial" w:cs="Arial" w:eastAsia="Arial" w:hAnsi="Arial"/>
+        </w:rPr>
+        <w:t xml:space="preserve">Where we give you a tracking number, please keep it. If a delivery goes wrong, contact the courier with your tracking details and tell us straight away so we can help follow it up. We will help where we can, but please follow up promptly, as couriers set their own time limits for claims.</w:t>
       </w:r>
     </w:p>
     <w:p>
@@ -964,7 +1023,7 @@
         <w:rPr>
           <w:rFonts w:ascii="Arial" w:cs="Arial" w:eastAsia="Arial" w:hAnsi="Arial"/>
         </w:rPr>
-        <w:t xml:space="preserve">We are not responsible for loss or damage that results from incorrect assembly, overloading or misuse, </w:t>
+        <w:t xml:space="preserve">You are responsible for checking that the product is suitable for your space and your intended use, including the strength and condition of the floor or wall it will stand on. We are not responsible for loss or damage that results from incorrect assembly, overloading or misuse, </w:t>
       </w:r>
       <w:r>
         <w:rPr>
@@ -995,7 +1054,7 @@
           <w:sz w:val="26"/>
           <w:szCs w:val="26"/>
         </w:rPr>
-        <w:t xml:space="preserve">11. Website use</w:t>
+        <w:t xml:space="preserve">11. Using our website</w:t>
       </w:r>
     </w:p>
     <w:p>
@@ -1022,23 +1081,55 @@
         <w:rPr>
           <w:rFonts w:ascii="Arial" w:cs="Arial" w:eastAsia="Arial" w:hAnsi="Arial"/>
         </w:rPr>
-        <w:t xml:space="preserve">use the website unlawfully, or to send harmful code or spam</w:t>
-      </w:r>
-    </w:p>
-    <w:p>
-      <w:pPr>
-        <w:pStyle w:val="ListParagraph"/>
-        <w:numPr>
-          <w:ilvl w:val="0"/>
-          <w:numId w:val="2"/>
-        </w:numPr>
-        <w:spacing w:after="100" w:line="300"/>
-      </w:pPr>
-      <w:r>
-        <w:rPr>
-          <w:rFonts w:ascii="Arial" w:cs="Arial" w:eastAsia="Arial" w:hAnsi="Arial"/>
-        </w:rPr>
-        <w:t xml:space="preserve">try to gain unauthorised access to the website or our systems</w:t>
+        <w:t xml:space="preserve">use the website for anything unlawful, fraudulent or misleading</w:t>
+      </w:r>
+    </w:p>
+    <w:p>
+      <w:pPr>
+        <w:pStyle w:val="ListParagraph"/>
+        <w:numPr>
+          <w:ilvl w:val="0"/>
+          <w:numId w:val="2"/>
+        </w:numPr>
+        <w:spacing w:after="100" w:line="300"/>
+      </w:pPr>
+      <w:r>
+        <w:rPr>
+          <w:rFonts w:ascii="Arial" w:cs="Arial" w:eastAsia="Arial" w:hAnsi="Arial"/>
+        </w:rPr>
+        <w:t xml:space="preserve">send harmful code, spam, or automated tools that scrape or overload the site</w:t>
+      </w:r>
+    </w:p>
+    <w:p>
+      <w:pPr>
+        <w:pStyle w:val="ListParagraph"/>
+        <w:numPr>
+          <w:ilvl w:val="0"/>
+          <w:numId w:val="2"/>
+        </w:numPr>
+        <w:spacing w:after="100" w:line="300"/>
+      </w:pPr>
+      <w:r>
+        <w:rPr>
+          <w:rFonts w:ascii="Arial" w:cs="Arial" w:eastAsia="Arial" w:hAnsi="Arial"/>
+        </w:rPr>
+        <w:t xml:space="preserve">try to gain unauthorised access to the website or our systems, or interfere with its security</w:t>
+      </w:r>
+    </w:p>
+    <w:p>
+      <w:pPr>
+        <w:pStyle w:val="ListParagraph"/>
+        <w:numPr>
+          <w:ilvl w:val="0"/>
+          <w:numId w:val="2"/>
+        </w:numPr>
+        <w:spacing w:after="100" w:line="300"/>
+      </w:pPr>
+      <w:r>
+        <w:rPr>
+          <w:rFonts w:ascii="Arial" w:cs="Arial" w:eastAsia="Arial" w:hAnsi="Arial"/>
+        </w:rPr>
+        <w:t xml:space="preserve">collect other people's personal information from the site</w:t>
       </w:r>
     </w:p>
     <w:p>
@@ -1065,7 +1156,7 @@
         <w:rPr>
           <w:rFonts w:ascii="Arial" w:cs="Arial" w:eastAsia="Arial" w:hAnsi="Arial"/>
         </w:rPr>
-        <w:t xml:space="preserve">We try to keep the website available and accurate, but we do not promise it will always be uninterrupted or error free.</w:t>
+        <w:t xml:space="preserve">We try to keep the website available and accurate, but we do not promise it will always be uninterrupted or error free. We may update, change or remove parts of the website at any time. We may refuse service or restrict access if you break these terms.</w:t>
       </w:r>
     </w:p>
     <w:p>
@@ -1082,7 +1173,7 @@
           <w:sz w:val="26"/>
           <w:szCs w:val="26"/>
         </w:rPr>
-        <w:t xml:space="preserve">12. Limit of our liability</w:t>
+        <w:t xml:space="preserve">12. Reviews, photos and competitions</w:t>
       </w:r>
     </w:p>
     <w:p>
@@ -1093,53 +1184,94 @@
         <w:rPr>
           <w:rFonts w:ascii="Arial" w:cs="Arial" w:eastAsia="Arial" w:hAnsi="Arial"/>
         </w:rPr>
-        <w:t xml:space="preserve">To the extent permitted by law, and subject to your rights under the Australian Consumer Law:</w:t>
-      </w:r>
-    </w:p>
-    <w:p>
-      <w:pPr>
-        <w:pStyle w:val="ListParagraph"/>
-        <w:numPr>
-          <w:ilvl w:val="0"/>
-          <w:numId w:val="2"/>
-        </w:numPr>
-        <w:spacing w:after="100" w:line="300"/>
-      </w:pPr>
-      <w:r>
-        <w:rPr>
-          <w:rFonts w:ascii="Arial" w:cs="Arial" w:eastAsia="Arial" w:hAnsi="Arial"/>
-        </w:rPr>
-        <w:t xml:space="preserve">our liability for any claim relating to a product is limited, at our choice, to </w:t>
-      </w:r>
-      <w:r>
-        <w:rPr>
-          <w:rFonts w:ascii="Arial" w:cs="Arial" w:eastAsia="Arial" w:hAnsi="Arial"/>
-          <w:b/>
-          <w:bCs/>
-        </w:rPr>
-        <w:t xml:space="preserve">replacing the goods, supplying equivalent goods, repairing the goods, or paying the cost of doing so</w:t>
-      </w:r>
-      <w:r>
-        <w:rPr>
-          <w:rFonts w:ascii="Arial" w:cs="Arial" w:eastAsia="Arial" w:hAnsi="Arial"/>
-        </w:rPr>
-        <w:t xml:space="preserve">; and</w:t>
-      </w:r>
-    </w:p>
-    <w:p>
-      <w:pPr>
-        <w:pStyle w:val="ListParagraph"/>
-        <w:numPr>
-          <w:ilvl w:val="0"/>
-          <w:numId w:val="2"/>
-        </w:numPr>
-        <w:spacing w:after="100" w:line="300"/>
-      </w:pPr>
-      <w:r>
-        <w:rPr>
-          <w:rFonts w:ascii="Arial" w:cs="Arial" w:eastAsia="Arial" w:hAnsi="Arial"/>
-        </w:rPr>
-        <w:t xml:space="preserve">we are not liable for indirect or consequential loss, such as lost profits or lost business.</w:t>
+        <w:t xml:space="preserve">If you send us a review, photo, video or other material - for example through our Share Your Experience page, by email, or on social media where you tag us - then:</w:t>
+      </w:r>
+    </w:p>
+    <w:p>
+      <w:pPr>
+        <w:pStyle w:val="ListParagraph"/>
+        <w:numPr>
+          <w:ilvl w:val="0"/>
+          <w:numId w:val="2"/>
+        </w:numPr>
+        <w:spacing w:after="100" w:line="300"/>
+      </w:pPr>
+      <w:r>
+        <w:rPr>
+          <w:rFonts w:ascii="Arial" w:cs="Arial" w:eastAsia="Arial" w:hAnsi="Arial"/>
+        </w:rPr>
+        <w:t xml:space="preserve">you give us permission to </w:t>
+      </w:r>
+      <w:r>
+        <w:rPr>
+          <w:rFonts w:ascii="Arial" w:cs="Arial" w:eastAsia="Arial" w:hAnsi="Arial"/>
+          <w:b/>
+          <w:bCs/>
+        </w:rPr>
+        <w:t xml:space="preserve">use, edit, copy and publish it</w:t>
+      </w:r>
+      <w:r>
+        <w:rPr>
+          <w:rFonts w:ascii="Arial" w:cs="Arial" w:eastAsia="Arial" w:hAnsi="Arial"/>
+        </w:rPr>
+        <w:t xml:space="preserve"> on our website, social media and marketing, in any format, without paying you </w:t>
+      </w:r>
+      <w:r>
+        <w:rPr>
+          <w:rFonts w:ascii="Arial" w:cs="Arial" w:eastAsia="Arial" w:hAnsi="Arial"/>
+          <w:b/>
+          <w:bCs/>
+          <w:shd w:fill="FFF2B3" w:color="auto" w:val="clear"/>
+        </w:rPr>
+        <w:t xml:space="preserve">[CONFIRM: any time limit, and whether you will use the customer's name]</w:t>
+      </w:r>
+    </w:p>
+    <w:p>
+      <w:pPr>
+        <w:pStyle w:val="ListParagraph"/>
+        <w:numPr>
+          <w:ilvl w:val="0"/>
+          <w:numId w:val="2"/>
+        </w:numPr>
+        <w:spacing w:after="100" w:line="300"/>
+      </w:pPr>
+      <w:r>
+        <w:rPr>
+          <w:rFonts w:ascii="Arial" w:cs="Arial" w:eastAsia="Arial" w:hAnsi="Arial"/>
+        </w:rPr>
+        <w:t xml:space="preserve">you confirm that you took or own the material, or have permission to share it, and that it does not break anyone's rights or include other identifiable people without their agreement</w:t>
+      </w:r>
+    </w:p>
+    <w:p>
+      <w:pPr>
+        <w:pStyle w:val="ListParagraph"/>
+        <w:numPr>
+          <w:ilvl w:val="0"/>
+          <w:numId w:val="2"/>
+        </w:numPr>
+        <w:spacing w:after="100" w:line="300"/>
+      </w:pPr>
+      <w:r>
+        <w:rPr>
+          <w:rFonts w:ascii="Arial" w:cs="Arial" w:eastAsia="Arial" w:hAnsi="Arial"/>
+        </w:rPr>
+        <w:t xml:space="preserve">we may choose not to publish it, or remove it later, for any reason, including if it is unlawful, offensive or misleading</w:t>
+      </w:r>
+    </w:p>
+    <w:p>
+      <w:pPr>
+        <w:pStyle w:val="ListParagraph"/>
+        <w:numPr>
+          <w:ilvl w:val="0"/>
+          <w:numId w:val="2"/>
+        </w:numPr>
+        <w:spacing w:after="100" w:line="300"/>
+      </w:pPr>
+      <w:r>
+        <w:rPr>
+          <w:rFonts w:ascii="Arial" w:cs="Arial" w:eastAsia="Arial" w:hAnsi="Arial"/>
+        </w:rPr>
+        <w:t xml:space="preserve">we are not required to keep it confidential, respond to it or pay for it</w:t>
       </w:r>
     </w:p>
     <w:p>
@@ -1149,8 +1281,25 @@
       <w:r>
         <w:rPr>
           <w:rFonts w:ascii="Arial" w:cs="Arial" w:eastAsia="Arial" w:hAnsi="Arial"/>
-        </w:rPr>
-        <w:t xml:space="preserve">This section does not exclude or limit any liability that cannot lawfully be excluded or limited.</w:t>
+          <w:b/>
+          <w:bCs/>
+        </w:rPr>
+        <w:t xml:space="preserve">Gift card entries:</w:t>
+      </w:r>
+      <w:r>
+        <w:rPr>
+          <w:rFonts w:ascii="Arial" w:cs="Arial" w:eastAsia="Arial" w:hAnsi="Arial"/>
+        </w:rPr>
+        <w:t xml:space="preserve"> photo submissions may be used for marketing purposes. Selected entries may be contacted about gift card rewards, which we award at our discretion following our review process. </w:t>
+      </w:r>
+      <w:r>
+        <w:rPr>
+          <w:rFonts w:ascii="Arial" w:cs="Arial" w:eastAsia="Arial" w:hAnsi="Arial"/>
+          <w:b/>
+          <w:bCs/>
+          <w:shd w:fill="FFF2B3" w:color="auto" w:val="clear"/>
+        </w:rPr>
+        <w:t xml:space="preserve">[CONFIRM and add full entry conditions - for example eligibility, how winners are chosen and contacted, and closing dates. Rules for competitions and promotions can differ between states, so have these checked before you run one.]</w:t>
       </w:r>
     </w:p>
     <w:p>
@@ -1167,7 +1316,7 @@
           <w:sz w:val="26"/>
           <w:szCs w:val="26"/>
         </w:rPr>
-        <w:t xml:space="preserve">13. Intellectual property</w:t>
+        <w:t xml:space="preserve">13. Trade and bulk orders</w:t>
       </w:r>
     </w:p>
     <w:p>
@@ -1177,8 +1326,110 @@
       <w:r>
         <w:rPr>
           <w:rFonts w:ascii="Arial" w:cs="Arial" w:eastAsia="Arial" w:hAnsi="Arial"/>
-        </w:rPr>
-        <w:t xml:space="preserve">All content on this website - including text, logos, images and design - belongs to us or our licensors and is protected by copyright. You may not use it without our written permission, except for personal, non-commercial use such as viewing the site.</w:t>
+          <w:b/>
+          <w:bCs/>
+          <w:shd w:fill="FFF2B3" w:color="auto" w:val="clear"/>
+        </w:rPr>
+        <w:t xml:space="preserve">[OPTIONAL - keep only if you sell on account or in bulk to businesses. Ask your lawyer to check this section.]</w:t>
+      </w:r>
+    </w:p>
+    <w:p>
+      <w:pPr>
+        <w:spacing w:after="160" w:line="300"/>
+      </w:pPr>
+      <w:r>
+        <w:rPr>
+          <w:rFonts w:ascii="Arial" w:cs="Arial" w:eastAsia="Arial" w:hAnsi="Arial"/>
+        </w:rPr>
+        <w:t xml:space="preserve">If you are buying for a business, or placing a large or bulk order:</w:t>
+      </w:r>
+    </w:p>
+    <w:p>
+      <w:pPr>
+        <w:pStyle w:val="ListParagraph"/>
+        <w:numPr>
+          <w:ilvl w:val="0"/>
+          <w:numId w:val="2"/>
+        </w:numPr>
+        <w:spacing w:after="100" w:line="300"/>
+      </w:pPr>
+      <w:r>
+        <w:rPr>
+          <w:rFonts w:ascii="Arial" w:cs="Arial" w:eastAsia="Arial" w:hAnsi="Arial"/>
+        </w:rPr>
+        <w:t xml:space="preserve">we may give you a written quote, which is valid for </w:t>
+      </w:r>
+      <w:r>
+        <w:rPr>
+          <w:rFonts w:ascii="Arial" w:cs="Arial" w:eastAsia="Arial" w:hAnsi="Arial"/>
+          <w:b/>
+          <w:bCs/>
+          <w:shd w:fill="FFF2B3" w:color="auto" w:val="clear"/>
+        </w:rPr>
+        <w:t xml:space="preserve">[30]</w:t>
+      </w:r>
+      <w:r>
+        <w:rPr>
+          <w:rFonts w:ascii="Arial" w:cs="Arial" w:eastAsia="Arial" w:hAnsi="Arial"/>
+        </w:rPr>
+        <w:t xml:space="preserve"> days unless it says otherwise</w:t>
+      </w:r>
+    </w:p>
+    <w:p>
+      <w:pPr>
+        <w:pStyle w:val="ListParagraph"/>
+        <w:numPr>
+          <w:ilvl w:val="0"/>
+          <w:numId w:val="2"/>
+        </w:numPr>
+        <w:spacing w:after="100" w:line="300"/>
+      </w:pPr>
+      <w:r>
+        <w:rPr>
+          <w:rFonts w:ascii="Arial" w:cs="Arial" w:eastAsia="Arial" w:hAnsi="Arial"/>
+        </w:rPr>
+        <w:t xml:space="preserve">we may ask for a deposit or full payment before we supply the goods </w:t>
+      </w:r>
+      <w:r>
+        <w:rPr>
+          <w:rFonts w:ascii="Arial" w:cs="Arial" w:eastAsia="Arial" w:hAnsi="Arial"/>
+          <w:b/>
+          <w:bCs/>
+          <w:shd w:fill="FFF2B3" w:color="auto" w:val="clear"/>
+        </w:rPr>
+        <w:t xml:space="preserve">[CONFIRM payment terms for approved trade accounts]</w:t>
+      </w:r>
+    </w:p>
+    <w:p>
+      <w:pPr>
+        <w:pStyle w:val="ListParagraph"/>
+        <w:numPr>
+          <w:ilvl w:val="0"/>
+          <w:numId w:val="2"/>
+        </w:numPr>
+        <w:spacing w:after="100" w:line="300"/>
+      </w:pPr>
+      <w:r>
+        <w:rPr>
+          <w:rFonts w:ascii="Arial" w:cs="Arial" w:eastAsia="Arial" w:hAnsi="Arial"/>
+        </w:rPr>
+        <w:t xml:space="preserve">ownership of the goods stays with us until we have been paid in full</w:t>
+      </w:r>
+    </w:p>
+    <w:p>
+      <w:pPr>
+        <w:pStyle w:val="ListParagraph"/>
+        <w:numPr>
+          <w:ilvl w:val="0"/>
+          <w:numId w:val="2"/>
+        </w:numPr>
+        <w:spacing w:after="100" w:line="300"/>
+      </w:pPr>
+      <w:r>
+        <w:rPr>
+          <w:rFonts w:ascii="Arial" w:cs="Arial" w:eastAsia="Arial" w:hAnsi="Arial"/>
+        </w:rPr>
+        <w:t xml:space="preserve">we may refuse or limit trade orders and may check your business and credit details before agreeing to supply on account</w:t>
       </w:r>
     </w:p>
     <w:p>
@@ -1195,7 +1446,7 @@
           <w:sz w:val="26"/>
           <w:szCs w:val="26"/>
         </w:rPr>
-        <w:t xml:space="preserve">14. Privacy</w:t>
+        <w:t xml:space="preserve">14. Limit of our liability</w:t>
       </w:r>
     </w:p>
     <w:p>
@@ -1206,30 +1457,80 @@
         <w:rPr>
           <w:rFonts w:ascii="Arial" w:cs="Arial" w:eastAsia="Arial" w:hAnsi="Arial"/>
         </w:rPr>
-        <w:t xml:space="preserve">We collect and use your personal information in line with our </w:t>
-      </w:r>
-      <w:r>
-        <w:rPr>
-          <w:rFonts w:ascii="Arial" w:cs="Arial" w:eastAsia="Arial" w:hAnsi="Arial"/>
-          <w:b/>
-          <w:bCs/>
-        </w:rPr>
-        <w:t xml:space="preserve">Privacy Policy</w:t>
-      </w:r>
-      <w:r>
-        <w:rPr>
-          <w:rFonts w:ascii="Arial" w:cs="Arial" w:eastAsia="Arial" w:hAnsi="Arial"/>
-        </w:rPr>
-        <w:t xml:space="preserve">. </w:t>
-      </w:r>
-      <w:r>
-        <w:rPr>
-          <w:rFonts w:ascii="Arial" w:cs="Arial" w:eastAsia="Arial" w:hAnsi="Arial"/>
-          <w:b/>
-          <w:bCs/>
-          <w:shd w:fill="FFF2B3" w:color="auto" w:val="clear"/>
-        </w:rPr>
-        <w:t xml:space="preserve">[CONFIRM you will publish a Privacy Policy - Shopify has a template.]</w:t>
+        <w:t xml:space="preserve">To the extent permitted by law, and subject to your rights under the Australian Consumer Law:</w:t>
+      </w:r>
+    </w:p>
+    <w:p>
+      <w:pPr>
+        <w:pStyle w:val="ListParagraph"/>
+        <w:numPr>
+          <w:ilvl w:val="0"/>
+          <w:numId w:val="2"/>
+        </w:numPr>
+        <w:spacing w:after="100" w:line="300"/>
+      </w:pPr>
+      <w:r>
+        <w:rPr>
+          <w:rFonts w:ascii="Arial" w:cs="Arial" w:eastAsia="Arial" w:hAnsi="Arial"/>
+        </w:rPr>
+        <w:t xml:space="preserve">we are not liable for indirect or consequential loss, such as lost profits or lost business, except where the law entitles you to compensation for reasonably foreseeable loss, for example under the consumer guarantees</w:t>
+      </w:r>
+    </w:p>
+    <w:p>
+      <w:pPr>
+        <w:pStyle w:val="ListParagraph"/>
+        <w:numPr>
+          <w:ilvl w:val="0"/>
+          <w:numId w:val="2"/>
+        </w:numPr>
+        <w:spacing w:after="100" w:line="300"/>
+      </w:pPr>
+      <w:r>
+        <w:rPr>
+          <w:rFonts w:ascii="Arial" w:cs="Arial" w:eastAsia="Arial" w:hAnsi="Arial"/>
+        </w:rPr>
+        <w:t xml:space="preserve">for goods </w:t>
+      </w:r>
+      <w:r>
+        <w:rPr>
+          <w:rFonts w:ascii="Arial" w:cs="Arial" w:eastAsia="Arial" w:hAnsi="Arial"/>
+          <w:b/>
+          <w:bCs/>
+        </w:rPr>
+        <w:t xml:space="preserve">not ordinarily bought for personal, domestic or household use</w:t>
+      </w:r>
+      <w:r>
+        <w:rPr>
+          <w:rFonts w:ascii="Arial" w:cs="Arial" w:eastAsia="Arial" w:hAnsi="Arial"/>
+        </w:rPr>
+        <w:t xml:space="preserve"> (for example goods bought for business use), our liability for a failure to meet a consumer guarantee is limited, as the law allows, to replacing the goods or supplying equivalent goods, repairing them, or paying the cost of replacing or repairing them</w:t>
+      </w:r>
+    </w:p>
+    <w:p>
+      <w:pPr>
+        <w:pStyle w:val="ListParagraph"/>
+        <w:numPr>
+          <w:ilvl w:val="0"/>
+          <w:numId w:val="2"/>
+        </w:numPr>
+        <w:spacing w:after="100" w:line="300"/>
+      </w:pPr>
+      <w:r>
+        <w:rPr>
+          <w:rFonts w:ascii="Arial" w:cs="Arial" w:eastAsia="Arial" w:hAnsi="Arial"/>
+        </w:rPr>
+        <w:t xml:space="preserve">if you are buying for business purposes, our total liability for any one claim is limited to the price you paid for the product concerned</w:t>
+      </w:r>
+    </w:p>
+    <w:p>
+      <w:pPr>
+        <w:spacing w:after="160" w:line="300"/>
+      </w:pPr>
+      <w:r>
+        <w:rPr>
+          <w:rFonts w:ascii="Arial" w:cs="Arial" w:eastAsia="Arial" w:hAnsi="Arial"/>
+        </w:rPr>
+        <w:t xml:space="preserve">This section does not exclude or limit any liability that cannot lawfully be excluded or limited.</w:t>
       </w:r>
     </w:p>
     <w:p>
@@ -1246,7 +1547,7 @@
           <w:sz w:val="26"/>
           <w:szCs w:val="26"/>
         </w:rPr>
-        <w:t xml:space="preserve">15. Third-party links and services</w:t>
+        <w:t xml:space="preserve">15. Intellectual property</w:t>
       </w:r>
     </w:p>
     <w:p>
@@ -1257,7 +1558,7 @@
         <w:rPr>
           <w:rFonts w:ascii="Arial" w:cs="Arial" w:eastAsia="Arial" w:hAnsi="Arial"/>
         </w:rPr>
-        <w:t xml:space="preserve">Our website may link to other websites or use third-party services, such as couriers and payment providers. We are not responsible for their content, policies or services.</w:t>
+        <w:t xml:space="preserve">All content on this website - including text, logos, images and design - belongs to us or our licensors and is protected by copyright. You may not use it without our written permission, except for personal, non-commercial use such as viewing the site.</w:t>
       </w:r>
     </w:p>
     <w:p>
@@ -1274,7 +1575,7 @@
           <w:sz w:val="26"/>
           <w:szCs w:val="26"/>
         </w:rPr>
-        <w:t xml:space="preserve">16. Events outside our control</w:t>
+        <w:t xml:space="preserve">16. Privacy</w:t>
       </w:r>
     </w:p>
     <w:p>
@@ -1285,7 +1586,30 @@
         <w:rPr>
           <w:rFonts w:ascii="Arial" w:cs="Arial" w:eastAsia="Arial" w:hAnsi="Arial"/>
         </w:rPr>
-        <w:t xml:space="preserve">We are not liable for delay or failure to perform our obligations caused by events outside our reasonable control, such as natural disasters, severe weather, strikes, supplier or courier delays, or government action. We will let you know if an event affects your order.</w:t>
+        <w:t xml:space="preserve">We collect and use your personal information in line with our </w:t>
+      </w:r>
+      <w:r>
+        <w:rPr>
+          <w:rFonts w:ascii="Arial" w:cs="Arial" w:eastAsia="Arial" w:hAnsi="Arial"/>
+          <w:b/>
+          <w:bCs/>
+        </w:rPr>
+        <w:t xml:space="preserve">Privacy Policy</w:t>
+      </w:r>
+      <w:r>
+        <w:rPr>
+          <w:rFonts w:ascii="Arial" w:cs="Arial" w:eastAsia="Arial" w:hAnsi="Arial"/>
+        </w:rPr>
+        <w:t xml:space="preserve">. </w:t>
+      </w:r>
+      <w:r>
+        <w:rPr>
+          <w:rFonts w:ascii="Arial" w:cs="Arial" w:eastAsia="Arial" w:hAnsi="Arial"/>
+          <w:b/>
+          <w:bCs/>
+          <w:shd w:fill="FFF2B3" w:color="auto" w:val="clear"/>
+        </w:rPr>
+        <w:t xml:space="preserve">[CONFIRM you will publish a Privacy Policy - Shopify has a template.]</w:t>
       </w:r>
     </w:p>
     <w:p>
@@ -1302,7 +1626,7 @@
           <w:sz w:val="26"/>
           <w:szCs w:val="26"/>
         </w:rPr>
-        <w:t xml:space="preserve">17. Changes to these terms</w:t>
+        <w:t xml:space="preserve">17. Third-party links and services</w:t>
       </w:r>
     </w:p>
     <w:p>
@@ -1313,7 +1637,7 @@
         <w:rPr>
           <w:rFonts w:ascii="Arial" w:cs="Arial" w:eastAsia="Arial" w:hAnsi="Arial"/>
         </w:rPr>
-        <w:t xml:space="preserve">We may update these terms from time to time. The version on the website when you place your order is the one that applies to that order.</w:t>
+        <w:t xml:space="preserve">Our website may link to other websites or use third-party services, such as couriers and payment providers. We are not responsible for their content, policies or services.</w:t>
       </w:r>
     </w:p>
     <w:p>
@@ -1330,7 +1654,7 @@
           <w:sz w:val="26"/>
           <w:szCs w:val="26"/>
         </w:rPr>
-        <w:t xml:space="preserve">18. Governing law</w:t>
+        <w:t xml:space="preserve">18. Events outside our control</w:t>
       </w:r>
     </w:p>
     <w:p>
@@ -1341,21 +1665,7 @@
         <w:rPr>
           <w:rFonts w:ascii="Arial" w:cs="Arial" w:eastAsia="Arial" w:hAnsi="Arial"/>
         </w:rPr>
-        <w:t xml:space="preserve">These terms are governed by the laws of </w:t>
-      </w:r>
-      <w:r>
-        <w:rPr>
-          <w:rFonts w:ascii="Arial" w:cs="Arial" w:eastAsia="Arial" w:hAnsi="Arial"/>
-          <w:b/>
-          <w:bCs/>
-        </w:rPr>
-        <w:t xml:space="preserve">Victoria, Australia</w:t>
-      </w:r>
-      <w:r>
-        <w:rPr>
-          <w:rFonts w:ascii="Arial" w:cs="Arial" w:eastAsia="Arial" w:hAnsi="Arial"/>
-        </w:rPr>
-        <w:t xml:space="preserve">. You and we submit to the non-exclusive jurisdiction of the courts of Victoria and the Commonwealth of Australia.</w:t>
+        <w:t xml:space="preserve">We are not liable for delay or failure to perform our obligations caused by events outside our reasonable control, such as natural disasters, severe weather, strikes, supplier or courier delays, or government action. We will let you know if an event affects your order.</w:t>
       </w:r>
     </w:p>
     <w:p>
@@ -1372,7 +1682,166 @@
           <w:sz w:val="26"/>
           <w:szCs w:val="26"/>
         </w:rPr>
-        <w:t xml:space="preserve">19. Contact us</w:t>
+        <w:t xml:space="preserve">19. General</w:t>
+      </w:r>
+    </w:p>
+    <w:p>
+      <w:pPr>
+        <w:pStyle w:val="ListParagraph"/>
+        <w:numPr>
+          <w:ilvl w:val="0"/>
+          <w:numId w:val="2"/>
+        </w:numPr>
+        <w:spacing w:after="100" w:line="300"/>
+      </w:pPr>
+      <w:r>
+        <w:rPr>
+          <w:rFonts w:ascii="Arial" w:cs="Arial" w:eastAsia="Arial" w:hAnsi="Arial"/>
+          <w:b/>
+          <w:bCs/>
+        </w:rPr>
+        <w:t xml:space="preserve">If part of these terms cannot be enforced,</w:t>
+      </w:r>
+      <w:r>
+        <w:rPr>
+          <w:rFonts w:ascii="Arial" w:cs="Arial" w:eastAsia="Arial" w:hAnsi="Arial"/>
+        </w:rPr>
+        <w:t xml:space="preserve"> the rest still applies.</w:t>
+      </w:r>
+    </w:p>
+    <w:p>
+      <w:pPr>
+        <w:pStyle w:val="ListParagraph"/>
+        <w:numPr>
+          <w:ilvl w:val="0"/>
+          <w:numId w:val="2"/>
+        </w:numPr>
+        <w:spacing w:after="100" w:line="300"/>
+      </w:pPr>
+      <w:r>
+        <w:rPr>
+          <w:rFonts w:ascii="Arial" w:cs="Arial" w:eastAsia="Arial" w:hAnsi="Arial"/>
+          <w:b/>
+          <w:bCs/>
+        </w:rPr>
+        <w:t xml:space="preserve">These terms, together with our Delivery Policy, Warranty Policy and any other policy we link to, are the whole agreement</w:t>
+      </w:r>
+      <w:r>
+        <w:rPr>
+          <w:rFonts w:ascii="Arial" w:cs="Arial" w:eastAsia="Arial" w:hAnsi="Arial"/>
+        </w:rPr>
+        <w:t xml:space="preserve"> between you and us about your order, and replace anything said earlier.</w:t>
+      </w:r>
+    </w:p>
+    <w:p>
+      <w:pPr>
+        <w:pStyle w:val="ListParagraph"/>
+        <w:numPr>
+          <w:ilvl w:val="0"/>
+          <w:numId w:val="2"/>
+        </w:numPr>
+        <w:spacing w:after="100" w:line="300"/>
+      </w:pPr>
+      <w:r>
+        <w:rPr>
+          <w:rFonts w:ascii="Arial" w:cs="Arial" w:eastAsia="Arial" w:hAnsi="Arial"/>
+          <w:b/>
+          <w:bCs/>
+        </w:rPr>
+        <w:t xml:space="preserve">If we don't enforce a right straight away,</w:t>
+      </w:r>
+      <w:r>
+        <w:rPr>
+          <w:rFonts w:ascii="Arial" w:cs="Arial" w:eastAsia="Arial" w:hAnsi="Arial"/>
+        </w:rPr>
+        <w:t xml:space="preserve"> that does not mean we have given it up.</w:t>
+      </w:r>
+    </w:p>
+    <w:p>
+      <w:pPr>
+        <w:pStyle w:val="Heading2"/>
+        <w:keepNext/>
+        <w:spacing w:after="120" w:before="280"/>
+      </w:pPr>
+      <w:r>
+        <w:rPr>
+          <w:rFonts w:ascii="Arial" w:cs="Arial" w:eastAsia="Arial" w:hAnsi="Arial"/>
+          <w:b/>
+          <w:bCs/>
+          <w:sz w:val="26"/>
+          <w:szCs w:val="26"/>
+        </w:rPr>
+        <w:t xml:space="preserve">20. Changes to these terms</w:t>
+      </w:r>
+    </w:p>
+    <w:p>
+      <w:pPr>
+        <w:spacing w:after="160" w:line="300"/>
+      </w:pPr>
+      <w:r>
+        <w:rPr>
+          <w:rFonts w:ascii="Arial" w:cs="Arial" w:eastAsia="Arial" w:hAnsi="Arial"/>
+        </w:rPr>
+        <w:t xml:space="preserve">We may update these terms from time to time by posting the new version on our website. The version on the website when you place your order is the one that applies to that order.</w:t>
+      </w:r>
+    </w:p>
+    <w:p>
+      <w:pPr>
+        <w:pStyle w:val="Heading2"/>
+        <w:keepNext/>
+        <w:spacing w:after="120" w:before="280"/>
+      </w:pPr>
+      <w:r>
+        <w:rPr>
+          <w:rFonts w:ascii="Arial" w:cs="Arial" w:eastAsia="Arial" w:hAnsi="Arial"/>
+          <w:b/>
+          <w:bCs/>
+          <w:sz w:val="26"/>
+          <w:szCs w:val="26"/>
+        </w:rPr>
+        <w:t xml:space="preserve">21. Governing law</w:t>
+      </w:r>
+    </w:p>
+    <w:p>
+      <w:pPr>
+        <w:spacing w:after="160" w:line="300"/>
+      </w:pPr>
+      <w:r>
+        <w:rPr>
+          <w:rFonts w:ascii="Arial" w:cs="Arial" w:eastAsia="Arial" w:hAnsi="Arial"/>
+        </w:rPr>
+        <w:t xml:space="preserve">These terms are governed by the laws of </w:t>
+      </w:r>
+      <w:r>
+        <w:rPr>
+          <w:rFonts w:ascii="Arial" w:cs="Arial" w:eastAsia="Arial" w:hAnsi="Arial"/>
+          <w:b/>
+          <w:bCs/>
+        </w:rPr>
+        <w:t xml:space="preserve">Victoria, Australia</w:t>
+      </w:r>
+      <w:r>
+        <w:rPr>
+          <w:rFonts w:ascii="Arial" w:cs="Arial" w:eastAsia="Arial" w:hAnsi="Arial"/>
+        </w:rPr>
+        <w:t xml:space="preserve">. You and we submit to the non-exclusive jurisdiction of the courts of Victoria and the Commonwealth of Australia.</w:t>
+      </w:r>
+    </w:p>
+    <w:p>
+      <w:pPr>
+        <w:pStyle w:val="Heading2"/>
+        <w:keepNext/>
+        <w:spacing w:after="120" w:before="280"/>
+      </w:pPr>
+      <w:r>
+        <w:rPr>
+          <w:rFonts w:ascii="Arial" w:cs="Arial" w:eastAsia="Arial" w:hAnsi="Arial"/>
+          <w:b/>
+          <w:bCs/>
+          <w:sz w:val="26"/>
+          <w:szCs w:val="26"/>
+        </w:rPr>
+        <w:t xml:space="preserve">22. Contact us</w:t>
       </w:r>
     </w:p>
     <w:p>

</xml_diff>